<commit_message>
Fix gitpage math symbols, resolve figure label overlaps, and pass ABAI QC audit
</commit_message>
<xml_diff>
--- a/docs/Photorespiration_multiomics_microgravity.docx
+++ b/docs/Photorespiration_multiomics_microgravity.docx
@@ -7352,7 +7352,7 @@
       <w:r>
         <w:drawing>
           <wp:inline>
-            <wp:extent cx="4907280" cy="1911812"/>
+            <wp:extent cx="4907280" cy="1915251"/>
             <wp:effectExtent b="0" l="0" r="0" t="0"/>
             <wp:docPr descr="" title="" id="56" name="Picture"/>
             <a:graphic>
@@ -7373,7 +7373,7 @@
                   <pic:spPr bwMode="auto">
                     <a:xfrm>
                       <a:off x="0" y="0"/>
-                      <a:ext cx="4907280" cy="1911812"/>
+                      <a:ext cx="4907280" cy="1915251"/>
                     </a:xfrm>
                     <a:prstGeom prst="rect">
                       <a:avLst/>

</xml_diff>

<commit_message>
Move Fig. 1b's legend below the panel so it hides no curve
The lower-left legend box covered the first ~10k steps of the three lit
curves (26 % of all plotted line samples). No free corner of the 1.5-inch
axes can hold a six-entry legend, so it now sits under the panel in three
columns (BRIC, CARA, vented pair), and the figure grows 0.48 in at the
bottom so every axes keeps its size.

main.pdf and main.docx are rebuilt (this also carries the KEGG citation)
and copied to docs/; the SI is textually unchanged.

Co-Authored-By: Claude Opus 5.5 <noreply@anthropic.com>
</commit_message>
<xml_diff>
--- a/docs/Photorespiration_multiomics_microgravity.docx
+++ b/docs/Photorespiration_multiomics_microgravity.docx
@@ -3634,7 +3634,7 @@
     </w:p>
     <w:bookmarkEnd w:id="18"/>
     <w:bookmarkEnd w:id="19"/>
-    <w:bookmarkStart w:id="76" w:name="sec:methods"/>
+    <w:bookmarkStart w:id="78" w:name="sec:methods"/>
     <w:p>
       <w:pPr>
         <w:pStyle w:val="Heading1"/>
@@ -3960,7 +3960,10 @@
         <w:t xml:space="preserve"> </w:t>
       </w:r>
       <w:r>
-        <w:t xml:space="preserve">(</w:t>
+        <w:t xml:space="preserve">(Kanehisa and Goto 2000;</w:t>
+      </w:r>
+      <w:r>
+        <w:t xml:space="preserve"> </w:t>
       </w:r>
       <w:r>
         <w:rPr>
@@ -5148,7 +5151,7 @@
       <w:r>
         <w:drawing>
           <wp:inline>
-            <wp:extent cx="5334000" cy="3066887"/>
+            <wp:extent cx="5334000" cy="3376827"/>
             <wp:effectExtent b="0" l="0" r="0" t="0"/>
             <wp:docPr descr="" title="" id="23" name="Picture"/>
             <a:graphic>
@@ -5169,7 +5172,7 @@
                   <pic:spPr bwMode="auto">
                     <a:xfrm>
                       <a:off x="0" y="0"/>
-                      <a:ext cx="5334000" cy="3066887"/>
+                      <a:ext cx="5334000" cy="3376827"/>
                     </a:xfrm>
                     <a:prstGeom prst="rect">
                       <a:avLst/>
@@ -5741,7 +5744,7 @@
       </w:r>
     </w:p>
     <w:bookmarkEnd w:id="53"/>
-    <w:bookmarkStart w:id="75" w:name="refs"/>
+    <w:bookmarkStart w:id="77" w:name="refs"/>
     <w:bookmarkStart w:id="55" w:name="ref-lunarleaf"/>
     <w:p>
       <w:pPr>
@@ -6194,40 +6197,104 @@
       </w:r>
     </w:p>
     <w:bookmarkEnd w:id="65"/>
-    <w:bookmarkStart w:id="67" w:name="ref-kegg"/>
+    <w:bookmarkStart w:id="67" w:name="ref-kanehisa2000"/>
     <w:p>
       <w:pPr>
         <w:pStyle w:val="Bibliography"/>
       </w:pPr>
       <w:r>
-        <w:rPr>
-          <w:i/>
-          <w:iCs/>
-        </w:rPr>
+        <w:t xml:space="preserve">Kanehisa, M., and S. Goto. 2000.</w:t>
+      </w:r>
+      <w:r>
+        <w:t xml:space="preserve"> </w:t>
+      </w:r>
+      <w:r>
+        <w:t xml:space="preserve">“</w:t>
+      </w:r>
+      <w:r>
         <w:t xml:space="preserve">KEGG</w:t>
       </w:r>
       <w:r>
-        <w:rPr>
-          <w:i/>
-          <w:iCs/>
-        </w:rPr>
         <w:t xml:space="preserve">:</w:t>
       </w:r>
       <w:r>
-        <w:rPr>
-          <w:i/>
-          <w:iCs/>
-        </w:rPr>
-        <w:t xml:space="preserve"> </w:t>
-      </w:r>
-      <w:r>
-        <w:rPr>
-          <w:i/>
-          <w:iCs/>
-        </w:rPr>
+        <w:t xml:space="preserve"> </w:t>
+      </w:r>
+      <w:r>
         <w:t xml:space="preserve">Kyoto</w:t>
       </w:r>
       <w:r>
+        <w:t xml:space="preserve"> </w:t>
+      </w:r>
+      <w:r>
+        <w:t xml:space="preserve">Encyclopedia of Genes and Genomes.”</w:t>
+      </w:r>
+      <w:r>
+        <w:t xml:space="preserve"> </w:t>
+      </w:r>
+      <w:r>
+        <w:rPr>
+          <w:i/>
+          <w:iCs/>
+        </w:rPr>
+        <w:t xml:space="preserve">Nucleic Acids Research</w:t>
+      </w:r>
+      <w:r>
+        <w:t xml:space="preserve"> </w:t>
+      </w:r>
+      <w:r>
+        <w:t xml:space="preserve">28 (1): 27–30.</w:t>
+      </w:r>
+      <w:r>
+        <w:t xml:space="preserve"> </w:t>
+      </w:r>
+      <w:hyperlink r:id="rId66">
+        <w:r>
+          <w:rPr>
+            <w:rStyle w:val="Hyperlink"/>
+          </w:rPr>
+          <w:t xml:space="preserve">https://doi.org/10.1093/nar/28.1.27</w:t>
+        </w:r>
+      </w:hyperlink>
+      <w:r>
+        <w:t xml:space="preserve">.</w:t>
+      </w:r>
+    </w:p>
+    <w:bookmarkEnd w:id="67"/>
+    <w:bookmarkStart w:id="69" w:name="ref-kegg"/>
+    <w:p>
+      <w:pPr>
+        <w:pStyle w:val="Bibliography"/>
+      </w:pPr>
+      <w:r>
+        <w:rPr>
+          <w:i/>
+          <w:iCs/>
+        </w:rPr>
+        <w:t xml:space="preserve">KEGG</w:t>
+      </w:r>
+      <w:r>
+        <w:rPr>
+          <w:i/>
+          <w:iCs/>
+        </w:rPr>
+        <w:t xml:space="preserve">:</w:t>
+      </w:r>
+      <w:r>
+        <w:rPr>
+          <w:i/>
+          <w:iCs/>
+        </w:rPr>
+        <w:t xml:space="preserve"> </w:t>
+      </w:r>
+      <w:r>
+        <w:rPr>
+          <w:i/>
+          <w:iCs/>
+        </w:rPr>
+        <w:t xml:space="preserve">Kyoto</w:t>
+      </w:r>
+      <w:r>
         <w:rPr>
           <w:i/>
           <w:iCs/>
@@ -6247,7 +6314,7 @@
       <w:r>
         <w:t xml:space="preserve"> </w:t>
       </w:r>
-      <w:hyperlink r:id="rId66">
+      <w:hyperlink r:id="rId68">
         <w:r>
           <w:rPr>
             <w:rStyle w:val="Hyperlink"/>
@@ -6259,8 +6326,8 @@
         <w:t xml:space="preserve">.</w:t>
       </w:r>
     </w:p>
-    <w:bookmarkEnd w:id="67"/>
-    <w:bookmarkStart w:id="68" w:name="ref-osd678"/>
+    <w:bookmarkEnd w:id="69"/>
+    <w:bookmarkStart w:id="70" w:name="ref-osd678"/>
     <w:p>
       <w:pPr>
         <w:pStyle w:val="Bibliography"/>
@@ -6306,8 +6373,8 @@
         <w:t xml:space="preserve">. 2023. NASA Open Science Data Repository, OSD-678 (CARA).</w:t>
       </w:r>
     </w:p>
-    <w:bookmarkEnd w:id="68"/>
-    <w:bookmarkStart w:id="70" w:name="ref-paintomics4"/>
+    <w:bookmarkEnd w:id="70"/>
+    <w:bookmarkStart w:id="72" w:name="ref-paintomics4"/>
     <w:p>
       <w:pPr>
         <w:pStyle w:val="Bibliography"/>
@@ -6349,7 +6416,7 @@
       <w:r>
         <w:t xml:space="preserve"> </w:t>
       </w:r>
-      <w:hyperlink r:id="rId69">
+      <w:hyperlink r:id="rId71">
         <w:r>
           <w:rPr>
             <w:rStyle w:val="Hyperlink"/>
@@ -6361,8 +6428,8 @@
         <w:t xml:space="preserve">.</w:t>
       </w:r>
     </w:p>
-    <w:bookmarkEnd w:id="70"/>
-    <w:bookmarkStart w:id="72" w:name="ref-pydeseq2"/>
+    <w:bookmarkEnd w:id="72"/>
+    <w:bookmarkStart w:id="74" w:name="ref-pydeseq2"/>
     <w:p>
       <w:pPr>
         <w:pStyle w:val="Bibliography"/>
@@ -6410,7 +6477,7 @@
       <w:r>
         <w:t xml:space="preserve"> </w:t>
       </w:r>
-      <w:hyperlink r:id="rId71">
+      <w:hyperlink r:id="rId73">
         <w:r>
           <w:rPr>
             <w:rStyle w:val="Hyperlink"/>
@@ -6422,8 +6489,8 @@
         <w:t xml:space="preserve">.</w:t>
       </w:r>
     </w:p>
-    <w:bookmarkEnd w:id="72"/>
-    <w:bookmarkStart w:id="73" w:name="ref-osd38"/>
+    <w:bookmarkEnd w:id="74"/>
+    <w:bookmarkStart w:id="75" w:name="ref-osd38"/>
     <w:p>
       <w:pPr>
         <w:pStyle w:val="Bibliography"/>
@@ -6469,8 +6536,8 @@
         <w:t xml:space="preserve">. 2015. NASA Open Science Data Repository, OSD-38 (BRIC-20).</w:t>
       </w:r>
     </w:p>
-    <w:bookmarkEnd w:id="73"/>
-    <w:bookmarkStart w:id="74" w:name="ref-osd321"/>
+    <w:bookmarkEnd w:id="75"/>
+    <w:bookmarkStart w:id="76" w:name="ref-osd321"/>
     <w:p>
       <w:pPr>
         <w:pStyle w:val="Bibliography"/>
@@ -6502,9 +6569,9 @@
         <w:t xml:space="preserve">. 2021. NASA Open Science Data Repository, OSD-321 (BRIC-22).</w:t>
       </w:r>
     </w:p>
-    <w:bookmarkEnd w:id="74"/>
-    <w:bookmarkEnd w:id="75"/>
     <w:bookmarkEnd w:id="76"/>
+    <w:bookmarkEnd w:id="77"/>
+    <w:bookmarkEnd w:id="78"/>
     <w:sectPr>
       <w:footnotePr>
         <w:numRestart w:val="eachSect"/>

</xml_diff>

<commit_message>
Put the repository URL in Code availability
The archived release DOI stays a TODO until the Zenodo deposit exists.
Main PDF and DOCX rebuilt and recopied to docs/; the SI rebuild was
text-identical, so it is not included.

Co-Authored-By: Claude Opus 5.5 <noreply@anthropic.com>
</commit_message>
<xml_diff>
--- a/docs/Photorespiration_multiomics_microgravity.docx
+++ b/docs/Photorespiration_multiomics_microgravity.docx
@@ -3553,7 +3553,7 @@
     </w:p>
     <w:bookmarkEnd w:id="18"/>
     <w:bookmarkEnd w:id="19"/>
-    <w:bookmarkStart w:id="78" w:name="sec:methods"/>
+    <w:bookmarkStart w:id="79" w:name="sec:methods"/>
     <w:p>
       <w:pPr>
         <w:pStyle w:val="Heading1"/>
@@ -4153,7 +4153,27 @@
         <w:pStyle w:val="BodyText"/>
       </w:pPr>
       <w:r>
-        <w:t xml:space="preserve">TODO insert the repository URL and archived release DOI.</w:t>
+        <w:t xml:space="preserve">The analysis code is available at</w:t>
+      </w:r>
+      <w:r>
+        <w:t xml:space="preserve"> </w:t>
+      </w:r>
+      <w:hyperlink r:id="rId20">
+        <w:r>
+          <w:rPr>
+            <w:rStyle w:val="Hyperlink"/>
+          </w:rPr>
+          <w:t xml:space="preserve">https://github.com/dr-richard-barker/Photorespiration_multiomics_microgravity</w:t>
+        </w:r>
+      </w:hyperlink>
+      <w:r>
+        <w:t xml:space="preserve">.</w:t>
+      </w:r>
+      <w:r>
+        <w:t xml:space="preserve"> </w:t>
+      </w:r>
+      <w:r>
+        <w:t xml:space="preserve">TODO insert the archived release DOI.</w:t>
       </w:r>
     </w:p>
     <w:p>
@@ -4188,7 +4208,7 @@
         <w:t xml:space="preserve">The authors declare no competing interests.</w:t>
       </w:r>
     </w:p>
-    <w:bookmarkStart w:id="20" w:name="tab:operating"/>
+    <w:bookmarkStart w:id="21" w:name="tab:operating"/>
     <w:p>
       <w:pPr>
         <w:pStyle w:val="TableCaption"/>
@@ -4632,9 +4652,9 @@
         </w:tc>
       </w:tr>
     </w:tbl>
-    <w:bookmarkEnd w:id="20"/>
+    <w:bookmarkEnd w:id="21"/>
     <w:p/>
-    <w:bookmarkStart w:id="21" w:name="tab:studies"/>
+    <w:bookmarkStart w:id="22" w:name="tab:studies"/>
     <w:p>
       <w:pPr>
         <w:pStyle w:val="TableCaption"/>
@@ -5141,8 +5161,8 @@
         </w:tc>
       </w:tr>
     </w:tbl>
-    <w:bookmarkEnd w:id="21"/>
-    <w:bookmarkStart w:id="25" w:name="fig:hardware"/>
+    <w:bookmarkEnd w:id="22"/>
+    <w:bookmarkStart w:id="26" w:name="fig:hardware"/>
     <w:p>
       <w:pPr>
         <w:pStyle w:val="CaptionedFigure"/>
@@ -5152,18 +5172,18 @@
           <wp:inline>
             <wp:extent cx="5334000" cy="3376827"/>
             <wp:effectExtent b="0" l="0" r="0" t="0"/>
-            <wp:docPr descr="" title="" id="23" name="Picture"/>
+            <wp:docPr descr="" title="" id="24" name="Picture"/>
             <a:graphic>
               <a:graphicData uri="http://schemas.openxmlformats.org/drawingml/2006/picture">
                 <pic:pic>
                   <pic:nvPicPr>
-                    <pic:cNvPr descr="fig01_hardware_atmosphere.png" id="24" name="Picture"/>
+                    <pic:cNvPr descr="fig01_hardware_atmosphere.png" id="25" name="Picture"/>
                     <pic:cNvPicPr>
                       <a:picLocks noChangeArrowheads="1" noChangeAspect="1"/>
                     </pic:cNvPicPr>
                   </pic:nvPicPr>
                   <pic:blipFill>
-                    <a:blip r:embed="rId22"/>
+                    <a:blip r:embed="rId23"/>
                     <a:stretch>
                       <a:fillRect/>
                     </a:stretch>
@@ -5234,8 +5254,8 @@
         <w:t xml:space="preserve">at the leaf surface, which is defined for all six cases and is the quantity the photosynthesis model consumes; the alternative series in the solver output, the mean over the enclosure volume, exists only for the four closed cases, because a vented enclosure has no closed volume to average.</w:t>
       </w:r>
     </w:p>
-    <w:bookmarkEnd w:id="25"/>
-    <w:bookmarkStart w:id="29" w:name="fig:fvcb"/>
+    <w:bookmarkEnd w:id="26"/>
+    <w:bookmarkStart w:id="30" w:name="fig:fvcb"/>
     <w:p>
       <w:pPr>
         <w:pStyle w:val="CaptionedFigure"/>
@@ -5245,18 +5265,18 @@
           <wp:inline>
             <wp:extent cx="5334000" cy="4070748"/>
             <wp:effectExtent b="0" l="0" r="0" t="0"/>
-            <wp:docPr descr="" title="" id="27" name="Picture"/>
+            <wp:docPr descr="" title="" id="28" name="Picture"/>
             <a:graphic>
               <a:graphicData uri="http://schemas.openxmlformats.org/drawingml/2006/picture">
                 <pic:pic>
                   <pic:nvPicPr>
-                    <pic:cNvPr descr="fig02_fvcb_operating_points.png" id="28" name="Picture"/>
+                    <pic:cNvPr descr="fig02_fvcb_operating_points.png" id="29" name="Picture"/>
                     <pic:cNvPicPr>
                       <a:picLocks noChangeArrowheads="1" noChangeAspect="1"/>
                     </pic:cNvPicPr>
                   </pic:nvPicPr>
                   <pic:blipFill>
-                    <a:blip r:embed="rId26"/>
+                    <a:blip r:embed="rId27"/>
                     <a:stretch>
                       <a:fillRect/>
                     </a:stretch>
@@ -5297,8 +5317,8 @@
         <w:t xml:space="preserve">refutation of our own starting hypothesis.</w:t>
       </w:r>
     </w:p>
-    <w:bookmarkEnd w:id="29"/>
-    <w:bookmarkStart w:id="33" w:name="fig:metabolome"/>
+    <w:bookmarkEnd w:id="30"/>
+    <w:bookmarkStart w:id="34" w:name="fig:metabolome"/>
     <w:p>
       <w:pPr>
         <w:pStyle w:val="CaptionedFigure"/>
@@ -5308,18 +5328,18 @@
           <wp:inline>
             <wp:extent cx="5334000" cy="3456415"/>
             <wp:effectExtent b="0" l="0" r="0" t="0"/>
-            <wp:docPr descr="" title="" id="31" name="Picture"/>
+            <wp:docPr descr="" title="" id="32" name="Picture"/>
             <a:graphic>
               <a:graphicData uri="http://schemas.openxmlformats.org/drawingml/2006/picture">
                 <pic:pic>
                   <pic:nvPicPr>
-                    <pic:cNvPr descr="fig03_predicted_metabolome.png" id="32" name="Picture"/>
+                    <pic:cNvPr descr="fig03_predicted_metabolome.png" id="33" name="Picture"/>
                     <pic:cNvPicPr>
                       <a:picLocks noChangeArrowheads="1" noChangeAspect="1"/>
                     </pic:cNvPicPr>
                   </pic:nvPicPr>
                   <pic:blipFill>
-                    <a:blip r:embed="rId30"/>
+                    <a:blip r:embed="rId31"/>
                     <a:stretch>
                       <a:fillRect/>
                     </a:stretch>
@@ -5354,8 +5374,8 @@
         <w:t xml:space="preserve">The metabolite layer had to be predicted. Every value shown is model output.</w:t>
       </w:r>
     </w:p>
-    <w:bookmarkEnd w:id="33"/>
-    <w:bookmarkStart w:id="37" w:name="fig:omics"/>
+    <w:bookmarkEnd w:id="34"/>
+    <w:bookmarkStart w:id="38" w:name="fig:omics"/>
     <w:p>
       <w:pPr>
         <w:pStyle w:val="CaptionedFigure"/>
@@ -5365,18 +5385,18 @@
           <wp:inline>
             <wp:extent cx="5334000" cy="4483574"/>
             <wp:effectExtent b="0" l="0" r="0" t="0"/>
-            <wp:docPr descr="" title="" id="35" name="Picture"/>
+            <wp:docPr descr="" title="" id="36" name="Picture"/>
             <a:graphic>
               <a:graphicData uri="http://schemas.openxmlformats.org/drawingml/2006/picture">
                 <pic:pic>
                   <pic:nvPicPr>
-                    <pic:cNvPr descr="fig04_osd522_omics.png" id="36" name="Picture"/>
+                    <pic:cNvPr descr="fig04_osd522_omics.png" id="37" name="Picture"/>
                     <pic:cNvPicPr>
                       <a:picLocks noChangeArrowheads="1" noChangeAspect="1"/>
                     </pic:cNvPicPr>
                   </pic:nvPicPr>
                   <pic:blipFill>
-                    <a:blip r:embed="rId34"/>
+                    <a:blip r:embed="rId35"/>
                     <a:stretch>
                       <a:fillRect/>
                     </a:stretch>
@@ -5427,8 +5447,8 @@
         <w:t xml:space="preserve">shoots, six flight against six ground.</w:t>
       </w:r>
     </w:p>
-    <w:bookmarkEnd w:id="37"/>
-    <w:bookmarkStart w:id="41" w:name="fig:blind"/>
+    <w:bookmarkEnd w:id="38"/>
+    <w:bookmarkStart w:id="42" w:name="fig:blind"/>
     <w:p>
       <w:pPr>
         <w:pStyle w:val="CaptionedFigure"/>
@@ -5438,18 +5458,18 @@
           <wp:inline>
             <wp:extent cx="5334000" cy="2557755"/>
             <wp:effectExtent b="0" l="0" r="0" t="0"/>
-            <wp:docPr descr="" title="" id="39" name="Picture"/>
+            <wp:docPr descr="" title="" id="40" name="Picture"/>
             <a:graphic>
               <a:graphicData uri="http://schemas.openxmlformats.org/drawingml/2006/picture">
                 <pic:pic>
                   <pic:nvPicPr>
-                    <pic:cNvPr descr="fig05_blind_test.png" id="40" name="Picture"/>
+                    <pic:cNvPr descr="fig05_blind_test.png" id="41" name="Picture"/>
                     <pic:cNvPicPr>
                       <a:picLocks noChangeArrowheads="1" noChangeAspect="1"/>
                     </pic:cNvPicPr>
                   </pic:nvPicPr>
                   <pic:blipFill>
-                    <a:blip r:embed="rId38"/>
+                    <a:blip r:embed="rId39"/>
                     <a:stretch>
                       <a:fillRect/>
                     </a:stretch>
@@ -5484,8 +5504,8 @@
         <w:t xml:space="preserve">The model’s prediction against the measurement.</w:t>
       </w:r>
     </w:p>
-    <w:bookmarkEnd w:id="41"/>
-    <w:bookmarkStart w:id="45" w:name="fig:paintomics"/>
+    <w:bookmarkEnd w:id="42"/>
+    <w:bookmarkStart w:id="46" w:name="fig:paintomics"/>
     <w:p>
       <w:pPr>
         <w:pStyle w:val="CaptionedFigure"/>
@@ -5495,18 +5515,18 @@
           <wp:inline>
             <wp:extent cx="5334000" cy="2919864"/>
             <wp:effectExtent b="0" l="0" r="0" t="0"/>
-            <wp:docPr descr="" title="" id="43" name="Picture"/>
+            <wp:docPr descr="" title="" id="44" name="Picture"/>
             <a:graphic>
               <a:graphicData uri="http://schemas.openxmlformats.org/drawingml/2006/picture">
                 <pic:pic>
                   <pic:nvPicPr>
-                    <pic:cNvPr descr="fig06_paintomics.png" id="44" name="Picture"/>
+                    <pic:cNvPr descr="fig06_paintomics.png" id="45" name="Picture"/>
                     <pic:cNvPicPr>
                       <a:picLocks noChangeArrowheads="1" noChangeAspect="1"/>
                     </pic:cNvPicPr>
                   </pic:nvPicPr>
                   <pic:blipFill>
-                    <a:blip r:embed="rId42"/>
+                    <a:blip r:embed="rId43"/>
                     <a:stretch>
                       <a:fillRect/>
                     </a:stretch>
@@ -5628,8 +5648,8 @@
         <w:t xml:space="preserve">722 measured loci against 488 in the photosynthesis bins themselves (Methods).</w:t>
       </w:r>
     </w:p>
-    <w:bookmarkEnd w:id="45"/>
-    <w:bookmarkStart w:id="49" w:name="fig:ladder"/>
+    <w:bookmarkEnd w:id="46"/>
+    <w:bookmarkStart w:id="50" w:name="fig:ladder"/>
     <w:p>
       <w:pPr>
         <w:pStyle w:val="CaptionedFigure"/>
@@ -5639,18 +5659,18 @@
           <wp:inline>
             <wp:extent cx="5334000" cy="3921333"/>
             <wp:effectExtent b="0" l="0" r="0" t="0"/>
-            <wp:docPr descr="" title="" id="47" name="Picture"/>
+            <wp:docPr descr="" title="" id="48" name="Picture"/>
             <a:graphic>
               <a:graphicData uri="http://schemas.openxmlformats.org/drawingml/2006/picture">
                 <pic:pic>
                   <pic:nvPicPr>
-                    <pic:cNvPr descr="fig07_hardware_ladder.png" id="48" name="Picture"/>
+                    <pic:cNvPr descr="fig07_hardware_ladder.png" id="49" name="Picture"/>
                     <pic:cNvPicPr>
                       <a:picLocks noChangeArrowheads="1" noChangeAspect="1"/>
                     </pic:cNvPicPr>
                   </pic:nvPicPr>
                   <pic:blipFill>
-                    <a:blip r:embed="rId46"/>
+                    <a:blip r:embed="rId47"/>
                     <a:stretch>
                       <a:fillRect/>
                     </a:stretch>
@@ -5685,8 +5705,8 @@
         <w:t xml:space="preserve">Illumination separates the six contrasts on starvation over photosynthesis; the enclosure gradient does not.</w:t>
       </w:r>
     </w:p>
-    <w:bookmarkEnd w:id="49"/>
-    <w:bookmarkStart w:id="53" w:name="fig:implications"/>
+    <w:bookmarkEnd w:id="50"/>
+    <w:bookmarkStart w:id="54" w:name="fig:implications"/>
     <w:p>
       <w:pPr>
         <w:pStyle w:val="CaptionedFigure"/>
@@ -5696,18 +5716,18 @@
           <wp:inline>
             <wp:extent cx="5334000" cy="2092126"/>
             <wp:effectExtent b="0" l="0" r="0" t="0"/>
-            <wp:docPr descr="" title="" id="51" name="Picture"/>
+            <wp:docPr descr="" title="" id="52" name="Picture"/>
             <a:graphic>
               <a:graphicData uri="http://schemas.openxmlformats.org/drawingml/2006/picture">
                 <pic:pic>
                   <pic:nvPicPr>
-                    <pic:cNvPr descr="fig08_implications.png" id="52" name="Picture"/>
+                    <pic:cNvPr descr="fig08_implications.png" id="53" name="Picture"/>
                     <pic:cNvPicPr>
                       <a:picLocks noChangeArrowheads="1" noChangeAspect="1"/>
                     </pic:cNvPicPr>
                   </pic:nvPicPr>
                   <pic:blipFill>
-                    <a:blip r:embed="rId50"/>
+                    <a:blip r:embed="rId51"/>
                     <a:stretch>
                       <a:fillRect/>
                     </a:stretch>
@@ -5742,9 +5762,9 @@
         <w:t xml:space="preserve">Designing the experiment that could tell hardware from gravity.</w:t>
       </w:r>
     </w:p>
-    <w:bookmarkEnd w:id="53"/>
-    <w:bookmarkStart w:id="77" w:name="refs"/>
-    <w:bookmarkStart w:id="55" w:name="ref-lunarleaf"/>
+    <w:bookmarkEnd w:id="54"/>
+    <w:bookmarkStart w:id="78" w:name="refs"/>
+    <w:bookmarkStart w:id="56" w:name="ref-lunarleaf"/>
     <w:p>
       <w:pPr>
         <w:pStyle w:val="Bibliography"/>
@@ -5796,7 +5816,7 @@
       <w:r>
         <w:t xml:space="preserve"> </w:t>
       </w:r>
-      <w:hyperlink r:id="rId54">
+      <w:hyperlink r:id="rId55">
         <w:r>
           <w:rPr>
             <w:rStyle w:val="Hyperlink"/>
@@ -5808,8 +5828,8 @@
         <w:t xml:space="preserve">.</w:t>
       </w:r>
     </w:p>
-    <w:bookmarkEnd w:id="55"/>
-    <w:bookmarkStart w:id="57" w:name="ref-bernacchi2003"/>
+    <w:bookmarkEnd w:id="56"/>
+    <w:bookmarkStart w:id="58" w:name="ref-bernacchi2003"/>
     <w:p>
       <w:pPr>
         <w:pStyle w:val="Bibliography"/>
@@ -5851,7 +5871,7 @@
       <w:r>
         <w:t xml:space="preserve"> </w:t>
       </w:r>
-      <w:hyperlink r:id="rId56">
+      <w:hyperlink r:id="rId57">
         <w:r>
           <w:rPr>
             <w:rStyle w:val="Hyperlink"/>
@@ -5863,8 +5883,8 @@
         <w:t xml:space="preserve">.</w:t>
       </w:r>
     </w:p>
-    <w:bookmarkEnd w:id="57"/>
-    <w:bookmarkStart w:id="59" w:name="ref-bernacchi2001"/>
+    <w:bookmarkEnd w:id="58"/>
+    <w:bookmarkStart w:id="60" w:name="ref-bernacchi2001"/>
     <w:p>
       <w:pPr>
         <w:pStyle w:val="Bibliography"/>
@@ -5906,7 +5926,7 @@
       <w:r>
         <w:t xml:space="preserve"> </w:t>
       </w:r>
-      <w:hyperlink r:id="rId58">
+      <w:hyperlink r:id="rId59">
         <w:r>
           <w:rPr>
             <w:rStyle w:val="Hyperlink"/>
@@ -5918,8 +5938,8 @@
         <w:t xml:space="preserve">.</w:t>
       </w:r>
     </w:p>
-    <w:bookmarkEnd w:id="59"/>
-    <w:bookmarkStart w:id="60" w:name="ref-osd427"/>
+    <w:bookmarkEnd w:id="60"/>
+    <w:bookmarkStart w:id="61" w:name="ref-osd427"/>
     <w:p>
       <w:pPr>
         <w:pStyle w:val="Bibliography"/>
@@ -5995,8 +6015,8 @@
         <w:t xml:space="preserve">. 2021. NASA Open Science Data Repository, OSD-427 (APEX-04).</w:t>
       </w:r>
     </w:p>
-    <w:bookmarkEnd w:id="60"/>
-    <w:bookmarkStart w:id="62" w:name="ref-farquhar1980"/>
+    <w:bookmarkEnd w:id="61"/>
+    <w:bookmarkStart w:id="63" w:name="ref-farquhar1980"/>
     <w:p>
       <w:pPr>
         <w:pStyle w:val="Bibliography"/>
@@ -6081,7 +6101,7 @@
       <w:r>
         <w:t xml:space="preserve"> </w:t>
       </w:r>
-      <w:hyperlink r:id="rId61">
+      <w:hyperlink r:id="rId62">
         <w:r>
           <w:rPr>
             <w:rStyle w:val="Hyperlink"/>
@@ -6093,8 +6113,8 @@
         <w:t xml:space="preserve">.</w:t>
       </w:r>
     </w:p>
-    <w:bookmarkEnd w:id="62"/>
-    <w:bookmarkStart w:id="64" w:name="ref-osdr2025"/>
+    <w:bookmarkEnd w:id="63"/>
+    <w:bookmarkStart w:id="65" w:name="ref-osdr2025"/>
     <w:p>
       <w:pPr>
         <w:pStyle w:val="Bibliography"/>
@@ -6136,7 +6156,7 @@
       <w:r>
         <w:t xml:space="preserve"> </w:t>
       </w:r>
-      <w:hyperlink r:id="rId63">
+      <w:hyperlink r:id="rId64">
         <w:r>
           <w:rPr>
             <w:rStyle w:val="Hyperlink"/>
@@ -6148,8 +6168,8 @@
         <w:t xml:space="preserve">.</w:t>
       </w:r>
     </w:p>
-    <w:bookmarkEnd w:id="64"/>
-    <w:bookmarkStart w:id="65" w:name="ref-osd522"/>
+    <w:bookmarkEnd w:id="65"/>
+    <w:bookmarkStart w:id="66" w:name="ref-osd522"/>
     <w:p>
       <w:pPr>
         <w:pStyle w:val="Bibliography"/>
@@ -6195,8 +6215,8 @@
         <w:t xml:space="preserve">. 2024. NASA Open Science Data Repository, OSD-522 (BRIC-LED-001).</w:t>
       </w:r>
     </w:p>
-    <w:bookmarkEnd w:id="65"/>
-    <w:bookmarkStart w:id="67" w:name="ref-kanehisa2000"/>
+    <w:bookmarkEnd w:id="66"/>
+    <w:bookmarkStart w:id="68" w:name="ref-kanehisa2000"/>
     <w:p>
       <w:pPr>
         <w:pStyle w:val="Bibliography"/>
@@ -6247,7 +6267,7 @@
       <w:r>
         <w:t xml:space="preserve"> </w:t>
       </w:r>
-      <w:hyperlink r:id="rId66">
+      <w:hyperlink r:id="rId67">
         <w:r>
           <w:rPr>
             <w:rStyle w:val="Hyperlink"/>
@@ -6259,8 +6279,8 @@
         <w:t xml:space="preserve">.</w:t>
       </w:r>
     </w:p>
-    <w:bookmarkEnd w:id="67"/>
-    <w:bookmarkStart w:id="69" w:name="ref-kegg"/>
+    <w:bookmarkEnd w:id="68"/>
+    <w:bookmarkStart w:id="70" w:name="ref-kegg"/>
     <w:p>
       <w:pPr>
         <w:pStyle w:val="Bibliography"/>
@@ -6313,7 +6333,7 @@
       <w:r>
         <w:t xml:space="preserve"> </w:t>
       </w:r>
-      <w:hyperlink r:id="rId68">
+      <w:hyperlink r:id="rId69">
         <w:r>
           <w:rPr>
             <w:rStyle w:val="Hyperlink"/>
@@ -6325,8 +6345,8 @@
         <w:t xml:space="preserve">.</w:t>
       </w:r>
     </w:p>
-    <w:bookmarkEnd w:id="69"/>
-    <w:bookmarkStart w:id="70" w:name="ref-osd678"/>
+    <w:bookmarkEnd w:id="70"/>
+    <w:bookmarkStart w:id="71" w:name="ref-osd678"/>
     <w:p>
       <w:pPr>
         <w:pStyle w:val="Bibliography"/>
@@ -6372,8 +6392,8 @@
         <w:t xml:space="preserve">. 2023. NASA Open Science Data Repository, OSD-678 (CARA).</w:t>
       </w:r>
     </w:p>
-    <w:bookmarkEnd w:id="70"/>
-    <w:bookmarkStart w:id="72" w:name="ref-paintomics4"/>
+    <w:bookmarkEnd w:id="71"/>
+    <w:bookmarkStart w:id="73" w:name="ref-paintomics4"/>
     <w:p>
       <w:pPr>
         <w:pStyle w:val="Bibliography"/>
@@ -6415,7 +6435,7 @@
       <w:r>
         <w:t xml:space="preserve"> </w:t>
       </w:r>
-      <w:hyperlink r:id="rId71">
+      <w:hyperlink r:id="rId72">
         <w:r>
           <w:rPr>
             <w:rStyle w:val="Hyperlink"/>
@@ -6427,8 +6447,8 @@
         <w:t xml:space="preserve">.</w:t>
       </w:r>
     </w:p>
-    <w:bookmarkEnd w:id="72"/>
-    <w:bookmarkStart w:id="74" w:name="ref-pydeseq2"/>
+    <w:bookmarkEnd w:id="73"/>
+    <w:bookmarkStart w:id="75" w:name="ref-pydeseq2"/>
     <w:p>
       <w:pPr>
         <w:pStyle w:val="Bibliography"/>
@@ -6476,7 +6496,7 @@
       <w:r>
         <w:t xml:space="preserve"> </w:t>
       </w:r>
-      <w:hyperlink r:id="rId73">
+      <w:hyperlink r:id="rId74">
         <w:r>
           <w:rPr>
             <w:rStyle w:val="Hyperlink"/>
@@ -6488,8 +6508,8 @@
         <w:t xml:space="preserve">.</w:t>
       </w:r>
     </w:p>
-    <w:bookmarkEnd w:id="74"/>
-    <w:bookmarkStart w:id="75" w:name="ref-osd38"/>
+    <w:bookmarkEnd w:id="75"/>
+    <w:bookmarkStart w:id="76" w:name="ref-osd38"/>
     <w:p>
       <w:pPr>
         <w:pStyle w:val="Bibliography"/>
@@ -6535,8 +6555,8 @@
         <w:t xml:space="preserve">. 2015. NASA Open Science Data Repository, OSD-38 (BRIC-20).</w:t>
       </w:r>
     </w:p>
-    <w:bookmarkEnd w:id="75"/>
-    <w:bookmarkStart w:id="76" w:name="ref-osd321"/>
+    <w:bookmarkEnd w:id="76"/>
+    <w:bookmarkStart w:id="77" w:name="ref-osd321"/>
     <w:p>
       <w:pPr>
         <w:pStyle w:val="Bibliography"/>
@@ -6568,9 +6588,9 @@
         <w:t xml:space="preserve">. 2021. NASA Open Science Data Repository, OSD-321 (BRIC-22).</w:t>
       </w:r>
     </w:p>
-    <w:bookmarkEnd w:id="76"/>
     <w:bookmarkEnd w:id="77"/>
     <w:bookmarkEnd w:id="78"/>
+    <w:bookmarkEnd w:id="79"/>
     <w:sectPr>
       <w:footnotePr>
         <w:numRestart w:val="eachSect"/>

</xml_diff>

<commit_message>
Make the manuscript sole-author and record Richard's checklist decisions
Richard confirmed (2026-10-30): sole author, keep the hardware-confound framing, keep the
UPR result to one paragraph, and he deposits both Zenodo DOIs himself. The co-author
placeholder is gone from main.tex and supplementary.tex, the contributions line is the
sole-author form, and the ORCID (checked on orcid.org) is in .zenodo.json. sn-jnl's \orcid
needs an Orcidlogo.eps the template did not ship, so it is entered at submission.

Two new checklist items: competing interests (CoSE develops plant-growth hardware) and an
AI-assistance statement. Affiliation, acknowledgements, funding and both DOIs stay TODO.

Co-Authored-By: Claude Opus 5.5 <noreply@anthropic.com>
</commit_message>
<xml_diff>
--- a/docs/Photorespiration_multiomics_microgravity.docx
+++ b/docs/Photorespiration_multiomics_microgravity.docx
@@ -31,11 +31,6 @@
       <w:r>
         <w:t xml:space="preserve">transcriptome, and illumination separates six flight contrasts</w:t>
       </w:r>
-    </w:p>
-    <w:p>
-      <w:pPr>
-        <w:pStyle w:val="Author"/>
-      </w:pPr>
     </w:p>
     <w:p>
       <w:pPr>
@@ -4189,6 +4184,14 @@
         <w:pStyle w:val="BodyText"/>
       </w:pPr>
       <w:r>
+        <w:t xml:space="preserve">R.B. is the sole author and takes responsibility for all of this work.</w:t>
+      </w:r>
+    </w:p>
+    <w:p>
+      <w:pPr>
+        <w:pStyle w:val="BodyText"/>
+      </w:pPr>
+      <w:r>
         <w:t xml:space="preserve">TODO.</w:t>
       </w:r>
     </w:p>
@@ -4197,15 +4200,7 @@
         <w:pStyle w:val="BodyText"/>
       </w:pPr>
       <w:r>
-        <w:t xml:space="preserve">TODO.</w:t>
-      </w:r>
-    </w:p>
-    <w:p>
-      <w:pPr>
-        <w:pStyle w:val="BodyText"/>
-      </w:pPr>
-      <w:r>
-        <w:t xml:space="preserve">The authors declare no competing interests.</w:t>
+        <w:t xml:space="preserve">The author declares no competing interests.</w:t>
       </w:r>
     </w:p>
     <w:bookmarkStart w:id="21" w:name="tab:operating"/>

</xml_diff>

<commit_message>
Add the AI-use, funding and competing-interests statements, and the affiliation
Richard's answers of 2026-10-30, in npj Microgravity's own wording where it gives one:
- Use of AI tools: npj Microgravity's submission guidelines say LLM use should be documented
  in Methods, so it is the last Methods subsection. What it says about each tool was read off
  the git history: Claude Code co-authored the analysis code and the manuscript commits; the
  only Google Antigravity lines left in the paper's scripts are figure layout, and its
  manuscript rewrite was reverted in f443787.
- Funding: "This study received no funding."
- Competing interests: "The author declares no financial or non-financial competing
  interests." (asked with CoSE's plant-growth hardware named).
- Affiliation: independent researcher. City and country are still TODO.

PDFs and DOCX rebuilt and recopied into docs/.

Co-Authored-By: Claude Opus 5.5 <noreply@anthropic.com>
</commit_message>
<xml_diff>
--- a/docs/Photorespiration_multiomics_microgravity.docx
+++ b/docs/Photorespiration_multiomics_microgravity.docx
@@ -3548,7 +3548,7 @@
     </w:p>
     <w:bookmarkEnd w:id="18"/>
     <w:bookmarkEnd w:id="19"/>
-    <w:bookmarkStart w:id="79" w:name="sec:methods"/>
+    <w:bookmarkStart w:id="80" w:name="sec:methods"/>
     <w:p>
       <w:pPr>
         <w:pStyle w:val="Heading1"/>
@@ -4092,6 +4092,53 @@
       </w:r>
       <w:r>
         <w:t xml:space="preserve">explained by any rule recoverable from PaintOmics’ published sources.</w:t>
+      </w:r>
+    </w:p>
+    <w:bookmarkStart w:id="79" w:name="use-of-ai-tools"/>
+    <w:p>
+      <w:pPr>
+        <w:pStyle w:val="Heading2"/>
+      </w:pPr>
+      <w:r>
+        <w:t xml:space="preserve">Use of AI tools</w:t>
+      </w:r>
+    </w:p>
+    <w:p>
+      <w:pPr>
+        <w:pStyle w:val="FirstParagraph"/>
+      </w:pPr>
+      <w:r>
+        <w:t xml:space="preserve">The analysis code, figures and manuscript text were drafted with Claude Code (Anthropic), an AI</w:t>
+      </w:r>
+      <w:r>
+        <w:t xml:space="preserve"> </w:t>
+      </w:r>
+      <w:r>
+        <w:t xml:space="preserve">coding assistant running Claude Opus models, working under the author’s direction. Google</w:t>
+      </w:r>
+      <w:r>
+        <w:t xml:space="preserve"> </w:t>
+      </w:r>
+      <w:r>
+        <w:t xml:space="preserve">Antigravity made figure-layout and website edits. The assistants also ran the checks that trace</w:t>
+      </w:r>
+      <w:r>
+        <w:t xml:space="preserve"> </w:t>
+      </w:r>
+      <w:r>
+        <w:t xml:space="preserve">each reported number to the script output that produces it and match each reference against</w:t>
+      </w:r>
+      <w:r>
+        <w:t xml:space="preserve"> </w:t>
+      </w:r>
+      <w:r>
+        <w:t xml:space="preserve">CrossRef or DataCite. The author directed the work, reviewed the results and takes full</w:t>
+      </w:r>
+      <w:r>
+        <w:t xml:space="preserve"> </w:t>
+      </w:r>
+      <w:r>
+        <w:t xml:space="preserve">responsibility for the content.</w:t>
       </w:r>
     </w:p>
     <w:p>
@@ -4192,7 +4239,7 @@
         <w:pStyle w:val="BodyText"/>
       </w:pPr>
       <w:r>
-        <w:t xml:space="preserve">TODO.</w:t>
+        <w:t xml:space="preserve">This study received no funding.</w:t>
       </w:r>
     </w:p>
     <w:p>
@@ -4200,7 +4247,7 @@
         <w:pStyle w:val="BodyText"/>
       </w:pPr>
       <w:r>
-        <w:t xml:space="preserve">The author declares no competing interests.</w:t>
+        <w:t xml:space="preserve">The author declares no financial or non-financial competing interests.</w:t>
       </w:r>
     </w:p>
     <w:bookmarkStart w:id="21" w:name="tab:operating"/>
@@ -6586,6 +6633,7 @@
     <w:bookmarkEnd w:id="77"/>
     <w:bookmarkEnd w:id="78"/>
     <w:bookmarkEnd w:id="79"/>
+    <w:bookmarkEnd w:id="80"/>
     <w:sectPr>
       <w:footnotePr>
         <w:numRestart w:val="eachSect"/>

</xml_diff>